<commit_message>
feat: add extensive project documentation and templates for Edital 04/2026 application support
</commit_message>
<xml_diff>
--- a/edital-04/CARTAS-APOIO.docx
+++ b/edital-04/CARTAS-APOIO.docx
@@ -214,7 +214,7 @@
           <w:bCs/>
           <w:b/>
         </w:rPr>
-        <w:t xml:space="preserve">https://sankofa-eosin.vercel.app</w:t>
+        <w:t xml:space="preserve">https://www.sankofahga.com</w:t>
       </w:r>
       <w:r>
         <w:t xml:space="preserve"> </w:t>
@@ -512,7 +512,7 @@
         <w:t xml:space="preserve"> </w:t>
       </w:r>
       <w:r>
-        <w:t xml:space="preserve">nhadafilipe@gmail.com · +55 [DDD número]</w:t>
+        <w:t xml:space="preserve">flifnhada@hotmail.com · +55 11 98483-7997</w:t>
       </w:r>
     </w:p>
     <w:p>
@@ -999,7 +999,7 @@
         <w:pStyle w:val="BodyText"/>
       </w:pPr>
       <w:r>
-        <w:t xml:space="preserve">O projeto está em fase pública (https://sankofa-eosin.vercel.app), licenciado MIT (código) e CC BY-SA 4.0 (conteúdo), em pleno alinhamento com a</w:t>
+        <w:t xml:space="preserve">O projeto está em fase pública (https://www.sankofahga.com), licenciado MIT (código) e CC BY-SA 4.0 (conteúdo), em pleno alinhamento com a</w:t>
       </w:r>
       <w:r>
         <w:t xml:space="preserve"> </w:t>
@@ -1254,7 +1254,7 @@
         <w:t xml:space="preserve"> </w:t>
       </w:r>
       <w:r>
-        <w:t xml:space="preserve">nhadafilipe@gmail.com · +55 [DDD número]</w:t>
+        <w:t xml:space="preserve">flifnhada@hotmail.com · +55 11 98483-7997</w:t>
       </w:r>
       <w:r>
         <w:t xml:space="preserve"> </w:t>
@@ -1738,7 +1738,7 @@
           <w:bCs/>
           <w:b/>
         </w:rPr>
-        <w:t xml:space="preserve">https://sankofa-eosin.vercel.app</w:t>
+        <w:t xml:space="preserve">https://www.sankofahga.com</w:t>
       </w:r>
     </w:p>
     <w:p>
@@ -1826,7 +1826,7 @@
         <w:t xml:space="preserve"> </w:t>
       </w:r>
       <w:r>
-        <w:t xml:space="preserve">nhadafilipe@gmail.com</w:t>
+        <w:t xml:space="preserve">flifnhada@hotmail.com</w:t>
       </w:r>
     </w:p>
     <w:p>
@@ -2159,7 +2159,7 @@
         <w:pStyle w:val="BodyText"/>
       </w:pPr>
       <w:r>
-        <w:t xml:space="preserve">Sou Filipe, criador do Sankofa — jogo digital sobre História Geral da África. URL: https://sankofa-eosin.vercel.app</w:t>
+        <w:t xml:space="preserve">Sou Filipe, criador do Sankofa — jogo digital sobre História Geral da África. URL: https://www.sankofahga.com</w:t>
       </w:r>
     </w:p>
     <w:p>
@@ -2541,7 +2541,7 @@
         <w:pStyle w:val="BodyText"/>
       </w:pPr>
       <w:r>
-        <w:t xml:space="preserve">URL: https://sankofa-eosin.vercel.app</w:t>
+        <w:t xml:space="preserve">URL: https://www.sankofahga.com</w:t>
       </w:r>
     </w:p>
     <w:p>
@@ -2643,7 +2643,7 @@
         <w:t xml:space="preserve"> </w:t>
       </w:r>
       <w:r>
-        <w:t xml:space="preserve">nhadafilipe@gmail.com</w:t>
+        <w:t xml:space="preserve">flifnhada@hotmail.com</w:t>
       </w:r>
     </w:p>
     <w:p>
@@ -3285,7 +3285,7 @@
         <w:pStyle w:val="BlockText"/>
       </w:pPr>
       <w:r>
-        <w:t xml:space="preserve">Link do projeto: https://sankofa-eosin.vercel.app</w:t>
+        <w:t xml:space="preserve">Link do projeto: https://www.sankofahga.com</w:t>
       </w:r>
     </w:p>
     <w:p>

</xml_diff>